<commit_message>
Add SCL-90 methods note and 2015–now structural-change supplement
Document Wang 2011 methods and whether SCL-90 is still used, with the
source first page embedded in a single DOCX. Add two Chinese and two
English papers from 2015 onward on coping, complex cognition, and
structural change, using the same four-point analysis format.

Co-authored-by: 36613453226Wallen <36613453226Wallen@users.noreply.github.com>
</commit_message>
<xml_diff>
--- a/收录/慢性应激大脑改变与睾酮保护_完整收录.docx
+++ b/收录/慢性应激大脑改变与睾酮保护_完整收录.docx
@@ -379,6 +379,21 @@
           <w:sz w:val="22"/>
         </w:rPr>
         <w:t>。因此境内两篇是检索补入，不是截图里带来的。</w:t>
+      </w:r>
+    </w:p>
+    <w:p>
+      <w:pPr>
+        <w:spacing w:after="120" w:line="360" w:lineRule="auto"/>
+      </w:pPr>
+      <w:r>
+        <w:rPr>
+          <w:rFonts w:ascii="Calibri" w:hAnsi="Calibri" w:eastAsia="WenQuanYi Micro Hei" w:cs="Calibri"/>
+          <w:b w:val="0"/>
+          <w:i w:val="0"/>
+          <w:color w:val="222222"/>
+          <w:sz w:val="22"/>
+        </w:rPr>
+        <w:t>后续补充里，用户又贴了王丽杰 2011 的《心理学报》首页（图一）和图二论点卡片。图一首页本身改标【截图他源】；2015 年至今补入的 4 篇（张建国 2024、杨云芳 2023、Abe 2022、Chmiel &amp; Kurpas 2025）仍为【Cursor网搜】。</w:t>
       </w:r>
     </w:p>
     <w:p>

</xml_diff>